<commit_message>
docs(write-up): correct coverage claims and prose formatting
- Preserve spacing after all bold "Impact:" labels.
- Restore the missing connectors in sections 1 through 3.
- Update the regression-suite count from 50 to 63.
- Replace the claim that every refusal path is covered with an accurate
  description of business-rule, documented-refusal, and regression
  coverage.
- Preserve the existing document layout and formatting.
</commit_message>
<xml_diff>
--- a/Improvements made to the charity-donor-outreach skill.docx
+++ b/Improvements made to the charity-donor-outreach skill.docx
@@ -44,7 +44,7 @@
         <w:t>Impact:</w:t>
       </w:r>
       <w:r>
-        <w:t xml:space="preserve"> eliminates the failure modes most likely to cause donor-relationship damage, press embarrassment, or regulatory scrutiny the ones no amount of output polish can compensate for.</w:t>
+        <w:t xml:space="preserve"> eliminates the failure modes most likely to cause donor-relationship damage, press embarrassment, or regulatory scrutiny—the ones no amount of output polish can compensate for.</w:t>
       </w:r>
     </w:p>
     <w:p>
@@ -82,7 +82,7 @@
         <w:t>Impact:</w:t>
       </w:r>
       <w:r>
-        <w:t xml:space="preserve"> the skill scales from 50 donors to 50,000 without modification, cannot contradict the CRM export, and stops leaking donor PII into prompts. It also enables progressive disclosure the script executes without loading its logic into context.</w:t>
+        <w:t xml:space="preserve"> the skill scales from 50 donors to 50,000 without modification, cannot contradict the CRM export, and stops leaking donor PII into prompts. It also enables progressive disclosure—the script executes without loading its logic into context.</w:t>
       </w:r>
     </w:p>
     <w:p>
@@ -124,7 +124,7 @@
         <w:t>;</w:t>
       </w:r>
       <w:r>
-        <w:t xml:space="preserve"> the case study's core "consistent, reliable" requirement and the charity can change rates or disable modifiers (e.g., the debatable volunteer surcharge) by editing a config file rather than prose. Making the rules executable also </w:t>
+        <w:t xml:space="preserve"> the case study's core "consistent, reliable" requirement is met, and the charity can change rates or disable modifiers (e.g., the debatable volunteer surcharge) by editing a config file rather than prose. Making the rules executable also </w:t>
       </w:r>
       <w:r>
         <w:rPr>
@@ -357,10 +357,10 @@
           <w:b/>
           <w:bCs/>
         </w:rPr>
-        <w:t>Impact: </w:t>
-      </w:r>
-      <w:r>
-        <w:t xml:space="preserve">letter volume is now independent of model effort: 50 donors and 50,000 donors need the same ten pieces of writing. Escaping, placeholder completeness, filename safety and the do-not-contact rule moved from instructions the model follows to guarantees the code enforces. Rendering the full sample takes about a second and is byte-identical on repeat runs.</w:t>
+        <w:t>Impact:</w:t>
+      </w:r>
+      <w:r>
+        <w:t xml:space="preserve"> letter volume is now independent of model effort: 50 donors and 50,000 donors need the same ten pieces of writing. Escaping, placeholder completeness, filename safety and the do-not-contact rule moved from instructions the model follows to guarantees the code enforces. Rendering the full sample takes about a second and is byte-identical on repeat runs.</w:t>
       </w:r>
     </w:p>
     <w:p>
@@ -434,10 +434,10 @@
           <w:b/>
           <w:bCs/>
         </w:rPr>
-        <w:t>Impact: </w:t>
-      </w:r>
-      <w:r>
-        <w:t xml:space="preserve">individually these are small; together they are the difference between a pipeline that is deterministic in principle and one that is deterministic in practice. Only one ask in the 50-donor sample changed as a result (a Silver donor's ask moved from $200 to $250 under correct rounding); the headline result is unchanged, with 33 donors cleared and 17 held for review.</w:t>
+        <w:t>Impact:</w:t>
+      </w:r>
+      <w:r>
+        <w:t xml:space="preserve"> individually these are small; together they are the difference between a pipeline that is deterministic in principle and one that is deterministic in practice. Only one ask in the 50-donor sample changed as a result (a Silver donor's ask moved from $200 to $250 under correct rounding); the headline result is unchanged, with 33 donors cleared and 17 held for review.</w:t>
       </w:r>
     </w:p>
     <w:p>
@@ -457,7 +457,7 @@
     </w:p>
     <w:p>
       <w:r>
-        <w:t xml:space="preserve">The skill ships with a 50-test regression suite using only the Python standard library, so it runs with no install step. A golden-file test pins the complete 50-donor output: any change to a rule shows up as a reviewable diff naming the donors whose asks moved, rather than as a silent shift in what people are asked to give. A second test asserts that the policy JSON matches the defaults in the code, so the documented rules cannot drift from the applied ones. The remaining tests cover each rule and each refusal path, including a named regression test for every defect in section 9.</w:t>
+        <w:t>The skill ships with a 63-test regression suite using only the Python standard library, so it runs with no install step. A golden-file test pins the complete 50-donor output: any change to a rule shows up as a reviewable diff naming the donors whose asks moved, rather than as a silent shift in what people are asked to give. A second test asserts that the policy JSON matches the defaults in the code, so the documented rules cannot drift from the applied ones. The remaining tests cover the business rules, documented refusal paths, and named regressions for the defects found through review.</w:t>
       </w:r>
     </w:p>
     <w:p>
@@ -471,10 +471,10 @@
           <w:b/>
           <w:bCs/>
         </w:rPr>
-        <w:t>Impact: </w:t>
-      </w:r>
-      <w:r>
-        <w:t xml:space="preserve">a fundraising team can change a rate, re-run the tests, and know within seconds whether anything else moved. Handover no longer depends on the person who wrote it.</w:t>
+        <w:t>Impact:</w:t>
+      </w:r>
+      <w:r>
+        <w:t xml:space="preserve"> a fundraising team can change a rate, re-run the tests, and know within seconds whether anything else moved. Handover no longer depends on the person who wrote it.</w:t>
       </w:r>
     </w:p>
     <w:p/>

</xml_diff>